<commit_message>
added model formulae for Pois and NB models to report
</commit_message>
<xml_diff>
--- a/output/reports/egg_odor_report.docx
+++ b/output/reports/egg_odor_report.docx
@@ -145,7 +145,7 @@
           <w:noProof/>
         </w:rPr>
         <w:drawing>
-          <wp:inline distT="0" distB="0" distL="0" distR="0" wp14:anchorId="76867D7F" wp14:editId="20897324">
+          <wp:inline distT="0" distB="0" distL="0" distR="0" wp14:anchorId="70410F06" wp14:editId="0AEA5AE2">
             <wp:extent cx="4587290" cy="2293645"/>
             <wp:effectExtent l="0" t="0" r="0" b="0"/>
             <wp:docPr id="21" name="Picture" descr="Figure 1. Sampling effort (trap deployments) by year, site, and treatment. Grey cells indicate treatment-year-site combinations that were not sampled."/>
@@ -287,19 +287,1773 @@
     </w:p>
     <w:p>
       <w:pPr>
+        <w:pStyle w:val="Heading2"/>
+        <w:rPr>
+          <w:rFonts w:ascii="Times New Roman" w:hAnsi="Times New Roman" w:cs="Times New Roman"/>
+        </w:rPr>
+      </w:pPr>
+      <w:bookmarkStart w:id="3" w:name="model-definition"/>
+      <w:bookmarkEnd w:id="2"/>
+      <w:r>
+        <w:rPr>
+          <w:rStyle w:val="SectionNumber"/>
+          <w:rFonts w:ascii="Times New Roman" w:hAnsi="Times New Roman" w:cs="Times New Roman"/>
+        </w:rPr>
+        <w:t>1.3</w:t>
+      </w:r>
+      <w:r>
+        <w:rPr>
+          <w:rFonts w:ascii="Times New Roman" w:hAnsi="Times New Roman" w:cs="Times New Roman"/>
+        </w:rPr>
+        <w:tab/>
+        <w:t>Model definition</w:t>
+      </w:r>
+    </w:p>
+    <w:p>
+      <w:pPr>
+        <w:pStyle w:val="FirstParagraph"/>
+        <w:rPr>
+          <w:rFonts w:ascii="Times New Roman" w:hAnsi="Times New Roman" w:cs="Times New Roman"/>
+        </w:rPr>
+      </w:pPr>
+      <w:r>
+        <w:rPr>
+          <w:rFonts w:ascii="Times New Roman" w:hAnsi="Times New Roman" w:cs="Times New Roman"/>
+        </w:rPr>
+        <w:t>Employing a Poisson likelihood, the model was defined as follows:</w:t>
+      </w:r>
+    </w:p>
+    <w:p>
+      <w:pPr>
+        <w:pStyle w:val="BodyText"/>
+        <w:rPr>
+          <w:rFonts w:ascii="Times New Roman" w:hAnsi="Times New Roman" w:cs="Times New Roman"/>
+        </w:rPr>
+      </w:pPr>
+      <m:oMathPara>
+        <m:oMathParaPr>
+          <m:jc m:val="center"/>
+        </m:oMathParaPr>
+        <m:oMath>
+          <m:sSub>
+            <m:sSubPr>
+              <m:ctrlPr>
+                <w:rPr>
+                  <w:rFonts w:ascii="Cambria Math" w:hAnsi="Cambria Math" w:cs="Times New Roman"/>
+                </w:rPr>
+              </m:ctrlPr>
+            </m:sSubPr>
+            <m:e>
+              <m:r>
+                <w:rPr>
+                  <w:rFonts w:ascii="Cambria Math" w:hAnsi="Cambria Math" w:cs="Times New Roman"/>
+                </w:rPr>
+                <m:t>y</m:t>
+              </m:r>
+            </m:e>
+            <m:sub>
+              <m:r>
+                <w:rPr>
+                  <w:rFonts w:ascii="Cambria Math" w:hAnsi="Cambria Math" w:cs="Times New Roman"/>
+                </w:rPr>
+                <m:t>ijk</m:t>
+              </m:r>
+            </m:sub>
+          </m:sSub>
+          <m:r>
+            <m:rPr>
+              <m:sty m:val="p"/>
+            </m:rPr>
+            <w:rPr>
+              <w:rFonts w:ascii="Cambria Math" w:hAnsi="Cambria Math" w:cs="Times New Roman"/>
+            </w:rPr>
+            <m:t>∣</m:t>
+          </m:r>
+          <m:sSub>
+            <m:sSubPr>
+              <m:ctrlPr>
+                <w:rPr>
+                  <w:rFonts w:ascii="Cambria Math" w:hAnsi="Cambria Math" w:cs="Times New Roman"/>
+                </w:rPr>
+              </m:ctrlPr>
+            </m:sSubPr>
+            <m:e>
+              <m:r>
+                <w:rPr>
+                  <w:rFonts w:ascii="Cambria Math" w:hAnsi="Cambria Math" w:cs="Times New Roman"/>
+                </w:rPr>
+                <m:t>u</m:t>
+              </m:r>
+            </m:e>
+            <m:sub>
+              <m:r>
+                <w:rPr>
+                  <w:rFonts w:ascii="Cambria Math" w:hAnsi="Cambria Math" w:cs="Times New Roman"/>
+                </w:rPr>
+                <m:t>i</m:t>
+              </m:r>
+            </m:sub>
+          </m:sSub>
+          <m:r>
+            <m:rPr>
+              <m:sty m:val="p"/>
+            </m:rPr>
+            <w:rPr>
+              <w:rFonts w:ascii="Cambria Math" w:hAnsi="Cambria Math" w:cs="Times New Roman"/>
+            </w:rPr>
+            <m:t>,</m:t>
+          </m:r>
+          <m:sSub>
+            <m:sSubPr>
+              <m:ctrlPr>
+                <w:rPr>
+                  <w:rFonts w:ascii="Cambria Math" w:hAnsi="Cambria Math" w:cs="Times New Roman"/>
+                </w:rPr>
+              </m:ctrlPr>
+            </m:sSubPr>
+            <m:e>
+              <m:r>
+                <w:rPr>
+                  <w:rFonts w:ascii="Cambria Math" w:hAnsi="Cambria Math" w:cs="Times New Roman"/>
+                </w:rPr>
+                <m:t>v</m:t>
+              </m:r>
+            </m:e>
+            <m:sub>
+              <m:r>
+                <w:rPr>
+                  <w:rFonts w:ascii="Cambria Math" w:hAnsi="Cambria Math" w:cs="Times New Roman"/>
+                </w:rPr>
+                <m:t>ij</m:t>
+              </m:r>
+            </m:sub>
+          </m:sSub>
+          <m:r>
+            <w:rPr>
+              <w:rFonts w:ascii="Cambria Math" w:hAnsi="Cambria Math" w:cs="Times New Roman"/>
+            </w:rPr>
+            <m:t> </m:t>
+          </m:r>
+          <m:r>
+            <m:rPr>
+              <m:sty m:val="p"/>
+            </m:rPr>
+            <w:rPr>
+              <w:rFonts w:ascii="Cambria Math" w:hAnsi="Cambria Math" w:cs="Times New Roman"/>
+            </w:rPr>
+            <m:t>∼</m:t>
+          </m:r>
+          <m:r>
+            <w:rPr>
+              <w:rFonts w:ascii="Cambria Math" w:hAnsi="Cambria Math" w:cs="Times New Roman"/>
+            </w:rPr>
+            <m:t> </m:t>
+          </m:r>
+          <m:r>
+            <m:rPr>
+              <m:nor/>
+            </m:rPr>
+            <w:rPr>
+              <w:rFonts w:ascii="Times New Roman" w:hAnsi="Times New Roman" w:cs="Times New Roman"/>
+            </w:rPr>
+            <m:t>Pois</m:t>
+          </m:r>
+          <m:d>
+            <m:dPr>
+              <m:ctrlPr>
+                <w:rPr>
+                  <w:rFonts w:ascii="Cambria Math" w:hAnsi="Cambria Math" w:cs="Times New Roman"/>
+                </w:rPr>
+              </m:ctrlPr>
+            </m:dPr>
+            <m:e>
+              <m:sSub>
+                <m:sSubPr>
+                  <m:ctrlPr>
+                    <w:rPr>
+                      <w:rFonts w:ascii="Cambria Math" w:hAnsi="Cambria Math" w:cs="Times New Roman"/>
+                    </w:rPr>
+                  </m:ctrlPr>
+                </m:sSubPr>
+                <m:e>
+                  <m:r>
+                    <w:rPr>
+                      <w:rFonts w:ascii="Cambria Math" w:hAnsi="Cambria Math" w:cs="Times New Roman"/>
+                    </w:rPr>
+                    <m:t>μ</m:t>
+                  </m:r>
+                </m:e>
+                <m:sub>
+                  <m:r>
+                    <w:rPr>
+                      <w:rFonts w:ascii="Cambria Math" w:hAnsi="Cambria Math" w:cs="Times New Roman"/>
+                    </w:rPr>
+                    <m:t>ijk</m:t>
+                  </m:r>
+                </m:sub>
+              </m:sSub>
+            </m:e>
+          </m:d>
+          <m:r>
+            <m:rPr>
+              <m:sty m:val="p"/>
+            </m:rPr>
+            <w:rPr>
+              <w:rFonts w:ascii="Cambria Math" w:hAnsi="Cambria Math" w:cs="Times New Roman"/>
+            </w:rPr>
+            <m:t>,</m:t>
+          </m:r>
+        </m:oMath>
+      </m:oMathPara>
+    </w:p>
+    <w:p>
+      <w:pPr>
+        <w:pStyle w:val="FirstParagraph"/>
+        <w:rPr>
+          <w:rFonts w:ascii="Times New Roman" w:hAnsi="Times New Roman" w:cs="Times New Roman"/>
+        </w:rPr>
+      </w:pPr>
+      <m:oMathPara>
+        <m:oMathParaPr>
+          <m:jc m:val="center"/>
+        </m:oMathParaPr>
+        <m:oMath>
+          <m:r>
+            <m:rPr>
+              <m:sty m:val="p"/>
+            </m:rPr>
+            <w:rPr>
+              <w:rFonts w:ascii="Cambria Math" w:hAnsi="Cambria Math" w:cs="Times New Roman"/>
+            </w:rPr>
+            <m:t>log</m:t>
+          </m:r>
+          <m:d>
+            <m:dPr>
+              <m:ctrlPr>
+                <w:rPr>
+                  <w:rFonts w:ascii="Cambria Math" w:hAnsi="Cambria Math" w:cs="Times New Roman"/>
+                </w:rPr>
+              </m:ctrlPr>
+            </m:dPr>
+            <m:e>
+              <m:sSub>
+                <m:sSubPr>
+                  <m:ctrlPr>
+                    <w:rPr>
+                      <w:rFonts w:ascii="Cambria Math" w:hAnsi="Cambria Math" w:cs="Times New Roman"/>
+                    </w:rPr>
+                  </m:ctrlPr>
+                </m:sSubPr>
+                <m:e>
+                  <m:r>
+                    <w:rPr>
+                      <w:rFonts w:ascii="Cambria Math" w:hAnsi="Cambria Math" w:cs="Times New Roman"/>
+                    </w:rPr>
+                    <m:t>μ</m:t>
+                  </m:r>
+                </m:e>
+                <m:sub>
+                  <m:r>
+                    <w:rPr>
+                      <w:rFonts w:ascii="Cambria Math" w:hAnsi="Cambria Math" w:cs="Times New Roman"/>
+                    </w:rPr>
+                    <m:t>ijk</m:t>
+                  </m:r>
+                </m:sub>
+              </m:sSub>
+            </m:e>
+          </m:d>
+          <m:r>
+            <m:rPr>
+              <m:sty m:val="p"/>
+            </m:rPr>
+            <w:rPr>
+              <w:rFonts w:ascii="Cambria Math" w:hAnsi="Cambria Math" w:cs="Times New Roman"/>
+            </w:rPr>
+            <m:t>=</m:t>
+          </m:r>
+          <m:sSub>
+            <m:sSubPr>
+              <m:ctrlPr>
+                <w:rPr>
+                  <w:rFonts w:ascii="Cambria Math" w:hAnsi="Cambria Math" w:cs="Times New Roman"/>
+                </w:rPr>
+              </m:ctrlPr>
+            </m:sSubPr>
+            <m:e>
+              <m:r>
+                <w:rPr>
+                  <w:rFonts w:ascii="Cambria Math" w:hAnsi="Cambria Math" w:cs="Times New Roman"/>
+                </w:rPr>
+                <m:t>β</m:t>
+              </m:r>
+            </m:e>
+            <m:sub>
+              <m:r>
+                <w:rPr>
+                  <w:rFonts w:ascii="Cambria Math" w:hAnsi="Cambria Math" w:cs="Times New Roman"/>
+                </w:rPr>
+                <m:t>0</m:t>
+              </m:r>
+            </m:sub>
+          </m:sSub>
+          <m:r>
+            <m:rPr>
+              <m:sty m:val="p"/>
+            </m:rPr>
+            <w:rPr>
+              <w:rFonts w:ascii="Cambria Math" w:hAnsi="Cambria Math" w:cs="Times New Roman"/>
+            </w:rPr>
+            <m:t>+</m:t>
+          </m:r>
+          <m:sSub>
+            <m:sSubPr>
+              <m:ctrlPr>
+                <w:rPr>
+                  <w:rFonts w:ascii="Cambria Math" w:hAnsi="Cambria Math" w:cs="Times New Roman"/>
+                </w:rPr>
+              </m:ctrlPr>
+            </m:sSubPr>
+            <m:e>
+              <m:r>
+                <w:rPr>
+                  <w:rFonts w:ascii="Cambria Math" w:hAnsi="Cambria Math" w:cs="Times New Roman"/>
+                </w:rPr>
+                <m:t>β</m:t>
+              </m:r>
+            </m:e>
+            <m:sub>
+              <m:r>
+                <w:rPr>
+                  <w:rFonts w:ascii="Cambria Math" w:hAnsi="Cambria Math" w:cs="Times New Roman"/>
+                </w:rPr>
+                <m:t>A</m:t>
+              </m:r>
+            </m:sub>
+          </m:sSub>
+          <m:sSub>
+            <m:sSubPr>
+              <m:ctrlPr>
+                <w:rPr>
+                  <w:rFonts w:ascii="Cambria Math" w:hAnsi="Cambria Math" w:cs="Times New Roman"/>
+                </w:rPr>
+              </m:ctrlPr>
+            </m:sSubPr>
+            <m:e>
+              <m:r>
+                <w:rPr>
+                  <w:rFonts w:ascii="Cambria Math" w:hAnsi="Cambria Math" w:cs="Times New Roman"/>
+                </w:rPr>
+                <m:t>x</m:t>
+              </m:r>
+            </m:e>
+            <m:sub>
+              <m:r>
+                <w:rPr>
+                  <w:rFonts w:ascii="Cambria Math" w:hAnsi="Cambria Math" w:cs="Times New Roman"/>
+                </w:rPr>
+                <m:t>A</m:t>
+              </m:r>
+              <m:r>
+                <m:rPr>
+                  <m:sty m:val="p"/>
+                </m:rPr>
+                <w:rPr>
+                  <w:rFonts w:ascii="Cambria Math" w:hAnsi="Cambria Math" w:cs="Times New Roman"/>
+                </w:rPr>
+                <m:t>,</m:t>
+              </m:r>
+              <m:r>
+                <w:rPr>
+                  <w:rFonts w:ascii="Cambria Math" w:hAnsi="Cambria Math" w:cs="Times New Roman"/>
+                </w:rPr>
+                <m:t>ijk</m:t>
+              </m:r>
+            </m:sub>
+          </m:sSub>
+          <m:r>
+            <m:rPr>
+              <m:sty m:val="p"/>
+            </m:rPr>
+            <w:rPr>
+              <w:rFonts w:ascii="Cambria Math" w:hAnsi="Cambria Math" w:cs="Times New Roman"/>
+            </w:rPr>
+            <m:t>+</m:t>
+          </m:r>
+          <m:sSub>
+            <m:sSubPr>
+              <m:ctrlPr>
+                <w:rPr>
+                  <w:rFonts w:ascii="Cambria Math" w:hAnsi="Cambria Math" w:cs="Times New Roman"/>
+                </w:rPr>
+              </m:ctrlPr>
+            </m:sSubPr>
+            <m:e>
+              <m:r>
+                <w:rPr>
+                  <w:rFonts w:ascii="Cambria Math" w:hAnsi="Cambria Math" w:cs="Times New Roman"/>
+                </w:rPr>
+                <m:t>β</m:t>
+              </m:r>
+            </m:e>
+            <m:sub>
+              <m:r>
+                <w:rPr>
+                  <w:rFonts w:ascii="Cambria Math" w:hAnsi="Cambria Math" w:cs="Times New Roman"/>
+                </w:rPr>
+                <m:t>E</m:t>
+              </m:r>
+            </m:sub>
+          </m:sSub>
+          <m:sSub>
+            <m:sSubPr>
+              <m:ctrlPr>
+                <w:rPr>
+                  <w:rFonts w:ascii="Cambria Math" w:hAnsi="Cambria Math" w:cs="Times New Roman"/>
+                </w:rPr>
+              </m:ctrlPr>
+            </m:sSubPr>
+            <m:e>
+              <m:r>
+                <w:rPr>
+                  <w:rFonts w:ascii="Cambria Math" w:hAnsi="Cambria Math" w:cs="Times New Roman"/>
+                </w:rPr>
+                <m:t>x</m:t>
+              </m:r>
+            </m:e>
+            <m:sub>
+              <m:r>
+                <w:rPr>
+                  <w:rFonts w:ascii="Cambria Math" w:hAnsi="Cambria Math" w:cs="Times New Roman"/>
+                </w:rPr>
+                <m:t>E</m:t>
+              </m:r>
+              <m:r>
+                <m:rPr>
+                  <m:sty m:val="p"/>
+                </m:rPr>
+                <w:rPr>
+                  <w:rFonts w:ascii="Cambria Math" w:hAnsi="Cambria Math" w:cs="Times New Roman"/>
+                </w:rPr>
+                <m:t>,</m:t>
+              </m:r>
+              <m:r>
+                <w:rPr>
+                  <w:rFonts w:ascii="Cambria Math" w:hAnsi="Cambria Math" w:cs="Times New Roman"/>
+                </w:rPr>
+                <m:t>ijk</m:t>
+              </m:r>
+            </m:sub>
+          </m:sSub>
+          <m:r>
+            <m:rPr>
+              <m:sty m:val="p"/>
+            </m:rPr>
+            <w:rPr>
+              <w:rFonts w:ascii="Cambria Math" w:hAnsi="Cambria Math" w:cs="Times New Roman"/>
+            </w:rPr>
+            <m:t>+</m:t>
+          </m:r>
+          <m:sSub>
+            <m:sSubPr>
+              <m:ctrlPr>
+                <w:rPr>
+                  <w:rFonts w:ascii="Cambria Math" w:hAnsi="Cambria Math" w:cs="Times New Roman"/>
+                </w:rPr>
+              </m:ctrlPr>
+            </m:sSubPr>
+            <m:e>
+              <m:r>
+                <w:rPr>
+                  <w:rFonts w:ascii="Cambria Math" w:hAnsi="Cambria Math" w:cs="Times New Roman"/>
+                </w:rPr>
+                <m:t>β</m:t>
+              </m:r>
+            </m:e>
+            <m:sub>
+              <m:r>
+                <w:rPr>
+                  <w:rFonts w:ascii="Cambria Math" w:hAnsi="Cambria Math" w:cs="Times New Roman"/>
+                </w:rPr>
+                <m:t>J</m:t>
+              </m:r>
+            </m:sub>
+          </m:sSub>
+          <m:sSub>
+            <m:sSubPr>
+              <m:ctrlPr>
+                <w:rPr>
+                  <w:rFonts w:ascii="Cambria Math" w:hAnsi="Cambria Math" w:cs="Times New Roman"/>
+                </w:rPr>
+              </m:ctrlPr>
+            </m:sSubPr>
+            <m:e>
+              <m:r>
+                <w:rPr>
+                  <w:rFonts w:ascii="Cambria Math" w:hAnsi="Cambria Math" w:cs="Times New Roman"/>
+                </w:rPr>
+                <m:t>x</m:t>
+              </m:r>
+            </m:e>
+            <m:sub>
+              <m:r>
+                <w:rPr>
+                  <w:rFonts w:ascii="Cambria Math" w:hAnsi="Cambria Math" w:cs="Times New Roman"/>
+                </w:rPr>
+                <m:t>J</m:t>
+              </m:r>
+              <m:r>
+                <m:rPr>
+                  <m:sty m:val="p"/>
+                </m:rPr>
+                <w:rPr>
+                  <w:rFonts w:ascii="Cambria Math" w:hAnsi="Cambria Math" w:cs="Times New Roman"/>
+                </w:rPr>
+                <m:t>,</m:t>
+              </m:r>
+              <m:r>
+                <w:rPr>
+                  <w:rFonts w:ascii="Cambria Math" w:hAnsi="Cambria Math" w:cs="Times New Roman"/>
+                </w:rPr>
+                <m:t>ijk</m:t>
+              </m:r>
+            </m:sub>
+          </m:sSub>
+          <m:r>
+            <m:rPr>
+              <m:sty m:val="p"/>
+            </m:rPr>
+            <w:rPr>
+              <w:rFonts w:ascii="Cambria Math" w:hAnsi="Cambria Math" w:cs="Times New Roman"/>
+            </w:rPr>
+            <m:t>+</m:t>
+          </m:r>
+          <m:sSub>
+            <m:sSubPr>
+              <m:ctrlPr>
+                <w:rPr>
+                  <w:rFonts w:ascii="Cambria Math" w:hAnsi="Cambria Math" w:cs="Times New Roman"/>
+                </w:rPr>
+              </m:ctrlPr>
+            </m:sSubPr>
+            <m:e>
+              <m:r>
+                <w:rPr>
+                  <w:rFonts w:ascii="Cambria Math" w:hAnsi="Cambria Math" w:cs="Times New Roman"/>
+                </w:rPr>
+                <m:t>u</m:t>
+              </m:r>
+            </m:e>
+            <m:sub>
+              <m:r>
+                <w:rPr>
+                  <w:rFonts w:ascii="Cambria Math" w:hAnsi="Cambria Math" w:cs="Times New Roman"/>
+                </w:rPr>
+                <m:t>i</m:t>
+              </m:r>
+            </m:sub>
+          </m:sSub>
+          <m:r>
+            <m:rPr>
+              <m:sty m:val="p"/>
+            </m:rPr>
+            <w:rPr>
+              <w:rFonts w:ascii="Cambria Math" w:hAnsi="Cambria Math" w:cs="Times New Roman"/>
+            </w:rPr>
+            <m:t>+</m:t>
+          </m:r>
+          <m:sSub>
+            <m:sSubPr>
+              <m:ctrlPr>
+                <w:rPr>
+                  <w:rFonts w:ascii="Cambria Math" w:hAnsi="Cambria Math" w:cs="Times New Roman"/>
+                </w:rPr>
+              </m:ctrlPr>
+            </m:sSubPr>
+            <m:e>
+              <m:r>
+                <w:rPr>
+                  <w:rFonts w:ascii="Cambria Math" w:hAnsi="Cambria Math" w:cs="Times New Roman"/>
+                </w:rPr>
+                <m:t>v</m:t>
+              </m:r>
+            </m:e>
+            <m:sub>
+              <m:r>
+                <w:rPr>
+                  <w:rFonts w:ascii="Cambria Math" w:hAnsi="Cambria Math" w:cs="Times New Roman"/>
+                </w:rPr>
+                <m:t>ij</m:t>
+              </m:r>
+            </m:sub>
+          </m:sSub>
+          <m:r>
+            <m:rPr>
+              <m:sty m:val="p"/>
+            </m:rPr>
+            <w:rPr>
+              <w:rFonts w:ascii="Cambria Math" w:hAnsi="Cambria Math" w:cs="Times New Roman"/>
+            </w:rPr>
+            <m:t>,</m:t>
+          </m:r>
+        </m:oMath>
+      </m:oMathPara>
+    </w:p>
+    <w:p>
+      <w:pPr>
+        <w:pStyle w:val="FirstParagraph"/>
+        <w:rPr>
+          <w:rFonts w:ascii="Times New Roman" w:hAnsi="Times New Roman" w:cs="Times New Roman"/>
+        </w:rPr>
+      </w:pPr>
+      <m:oMathPara>
+        <m:oMathParaPr>
+          <m:jc m:val="center"/>
+        </m:oMathParaPr>
+        <m:oMath>
+          <m:sSub>
+            <m:sSubPr>
+              <m:ctrlPr>
+                <w:rPr>
+                  <w:rFonts w:ascii="Cambria Math" w:hAnsi="Cambria Math" w:cs="Times New Roman"/>
+                </w:rPr>
+              </m:ctrlPr>
+            </m:sSubPr>
+            <m:e>
+              <m:r>
+                <w:rPr>
+                  <w:rFonts w:ascii="Cambria Math" w:hAnsi="Cambria Math" w:cs="Times New Roman"/>
+                </w:rPr>
+                <m:t>u</m:t>
+              </m:r>
+            </m:e>
+            <m:sub>
+              <m:r>
+                <w:rPr>
+                  <w:rFonts w:ascii="Cambria Math" w:hAnsi="Cambria Math" w:cs="Times New Roman"/>
+                </w:rPr>
+                <m:t>i</m:t>
+              </m:r>
+            </m:sub>
+          </m:sSub>
+          <m:r>
+            <m:rPr>
+              <m:scr m:val="script"/>
+              <m:sty m:val="p"/>
+            </m:rPr>
+            <w:rPr>
+              <w:rFonts w:ascii="Cambria Math" w:hAnsi="Cambria Math" w:cs="Times New Roman"/>
+            </w:rPr>
+            <m:t>∼N</m:t>
+          </m:r>
+          <m:d>
+            <m:dPr>
+              <m:ctrlPr>
+                <w:rPr>
+                  <w:rFonts w:ascii="Cambria Math" w:hAnsi="Cambria Math" w:cs="Times New Roman"/>
+                </w:rPr>
+              </m:ctrlPr>
+            </m:dPr>
+            <m:e>
+              <m:r>
+                <w:rPr>
+                  <w:rFonts w:ascii="Cambria Math" w:hAnsi="Cambria Math" w:cs="Times New Roman"/>
+                </w:rPr>
+                <m:t>0</m:t>
+              </m:r>
+              <m:r>
+                <m:rPr>
+                  <m:sty m:val="p"/>
+                </m:rPr>
+                <w:rPr>
+                  <w:rFonts w:ascii="Cambria Math" w:hAnsi="Cambria Math" w:cs="Times New Roman"/>
+                </w:rPr>
+                <m:t>,</m:t>
+              </m:r>
+              <m:r>
+                <w:rPr>
+                  <w:rFonts w:ascii="Cambria Math" w:hAnsi="Cambria Math" w:cs="Times New Roman"/>
+                </w:rPr>
+                <m:t> </m:t>
+              </m:r>
+              <m:sSubSup>
+                <m:sSubSupPr>
+                  <m:ctrlPr>
+                    <w:rPr>
+                      <w:rFonts w:ascii="Cambria Math" w:hAnsi="Cambria Math" w:cs="Times New Roman"/>
+                    </w:rPr>
+                  </m:ctrlPr>
+                </m:sSubSupPr>
+                <m:e>
+                  <m:r>
+                    <w:rPr>
+                      <w:rFonts w:ascii="Cambria Math" w:hAnsi="Cambria Math" w:cs="Times New Roman"/>
+                    </w:rPr>
+                    <m:t>σ</m:t>
+                  </m:r>
+                </m:e>
+                <m:sub>
+                  <m:r>
+                    <m:rPr>
+                      <m:nor/>
+                    </m:rPr>
+                    <w:rPr>
+                      <w:rFonts w:ascii="Times New Roman" w:hAnsi="Times New Roman" w:cs="Times New Roman"/>
+                    </w:rPr>
+                    <m:t>year-site</m:t>
+                  </m:r>
+                </m:sub>
+                <m:sup>
+                  <m:r>
+                    <w:rPr>
+                      <w:rFonts w:ascii="Cambria Math" w:hAnsi="Cambria Math" w:cs="Times New Roman"/>
+                    </w:rPr>
+                    <m:t>2</m:t>
+                  </m:r>
+                </m:sup>
+              </m:sSubSup>
+            </m:e>
+          </m:d>
+          <m:r>
+            <m:rPr>
+              <m:sty m:val="p"/>
+            </m:rPr>
+            <w:rPr>
+              <w:rFonts w:ascii="Cambria Math" w:hAnsi="Cambria Math" w:cs="Times New Roman"/>
+            </w:rPr>
+            <m:t>,</m:t>
+          </m:r>
+          <m:r>
+            <w:rPr>
+              <w:rFonts w:ascii="Cambria Math" w:hAnsi="Cambria Math" w:cs="Times New Roman"/>
+            </w:rPr>
+            <m:t>  </m:t>
+          </m:r>
+          <m:sSub>
+            <m:sSubPr>
+              <m:ctrlPr>
+                <w:rPr>
+                  <w:rFonts w:ascii="Cambria Math" w:hAnsi="Cambria Math" w:cs="Times New Roman"/>
+                </w:rPr>
+              </m:ctrlPr>
+            </m:sSubPr>
+            <m:e>
+              <m:r>
+                <w:rPr>
+                  <w:rFonts w:ascii="Cambria Math" w:hAnsi="Cambria Math" w:cs="Times New Roman"/>
+                </w:rPr>
+                <m:t>v</m:t>
+              </m:r>
+            </m:e>
+            <m:sub>
+              <m:r>
+                <w:rPr>
+                  <w:rFonts w:ascii="Cambria Math" w:hAnsi="Cambria Math" w:cs="Times New Roman"/>
+                </w:rPr>
+                <m:t>ij</m:t>
+              </m:r>
+            </m:sub>
+          </m:sSub>
+          <m:r>
+            <m:rPr>
+              <m:scr m:val="script"/>
+              <m:sty m:val="p"/>
+            </m:rPr>
+            <w:rPr>
+              <w:rFonts w:ascii="Cambria Math" w:hAnsi="Cambria Math" w:cs="Times New Roman"/>
+            </w:rPr>
+            <m:t>∼N</m:t>
+          </m:r>
+          <m:d>
+            <m:dPr>
+              <m:ctrlPr>
+                <w:rPr>
+                  <w:rFonts w:ascii="Cambria Math" w:hAnsi="Cambria Math" w:cs="Times New Roman"/>
+                </w:rPr>
+              </m:ctrlPr>
+            </m:dPr>
+            <m:e>
+              <m:r>
+                <w:rPr>
+                  <w:rFonts w:ascii="Cambria Math" w:hAnsi="Cambria Math" w:cs="Times New Roman"/>
+                </w:rPr>
+                <m:t>0</m:t>
+              </m:r>
+              <m:r>
+                <m:rPr>
+                  <m:sty m:val="p"/>
+                </m:rPr>
+                <w:rPr>
+                  <w:rFonts w:ascii="Cambria Math" w:hAnsi="Cambria Math" w:cs="Times New Roman"/>
+                </w:rPr>
+                <m:t>,</m:t>
+              </m:r>
+              <m:r>
+                <w:rPr>
+                  <w:rFonts w:ascii="Cambria Math" w:hAnsi="Cambria Math" w:cs="Times New Roman"/>
+                </w:rPr>
+                <m:t> </m:t>
+              </m:r>
+              <m:sSubSup>
+                <m:sSubSupPr>
+                  <m:ctrlPr>
+                    <w:rPr>
+                      <w:rFonts w:ascii="Cambria Math" w:hAnsi="Cambria Math" w:cs="Times New Roman"/>
+                    </w:rPr>
+                  </m:ctrlPr>
+                </m:sSubSupPr>
+                <m:e>
+                  <m:r>
+                    <w:rPr>
+                      <w:rFonts w:ascii="Cambria Math" w:hAnsi="Cambria Math" w:cs="Times New Roman"/>
+                    </w:rPr>
+                    <m:t>σ</m:t>
+                  </m:r>
+                </m:e>
+                <m:sub>
+                  <m:r>
+                    <m:rPr>
+                      <m:nor/>
+                    </m:rPr>
+                    <w:rPr>
+                      <w:rFonts w:ascii="Times New Roman" w:hAnsi="Times New Roman" w:cs="Times New Roman"/>
+                    </w:rPr>
+                    <m:t>day</m:t>
+                  </m:r>
+                </m:sub>
+                <m:sup>
+                  <m:r>
+                    <w:rPr>
+                      <w:rFonts w:ascii="Cambria Math" w:hAnsi="Cambria Math" w:cs="Times New Roman"/>
+                    </w:rPr>
+                    <m:t>2</m:t>
+                  </m:r>
+                </m:sup>
+              </m:sSubSup>
+            </m:e>
+          </m:d>
+          <m:r>
+            <m:rPr>
+              <m:sty m:val="p"/>
+            </m:rPr>
+            <w:rPr>
+              <w:rFonts w:ascii="Cambria Math" w:hAnsi="Cambria Math" w:cs="Times New Roman"/>
+            </w:rPr>
+            <m:t>,</m:t>
+          </m:r>
+        </m:oMath>
+      </m:oMathPara>
+    </w:p>
+    <w:p>
+      <w:pPr>
+        <w:pStyle w:val="FirstParagraph"/>
+        <w:rPr>
+          <w:rFonts w:ascii="Times New Roman" w:hAnsi="Times New Roman" w:cs="Times New Roman"/>
+        </w:rPr>
+      </w:pPr>
+      <w:r>
+        <w:rPr>
+          <w:rFonts w:ascii="Times New Roman" w:hAnsi="Times New Roman" w:cs="Times New Roman"/>
+        </w:rPr>
+        <w:t xml:space="preserve">where </w:t>
+      </w:r>
+      <m:oMath>
+        <m:sSub>
+          <m:sSubPr>
+            <m:ctrlPr>
+              <w:rPr>
+                <w:rFonts w:ascii="Cambria Math" w:hAnsi="Cambria Math" w:cs="Times New Roman"/>
+              </w:rPr>
+            </m:ctrlPr>
+          </m:sSubPr>
+          <m:e>
+            <m:r>
+              <w:rPr>
+                <w:rFonts w:ascii="Cambria Math" w:hAnsi="Cambria Math" w:cs="Times New Roman"/>
+              </w:rPr>
+              <m:t>y</m:t>
+            </m:r>
+          </m:e>
+          <m:sub>
+            <m:r>
+              <w:rPr>
+                <w:rFonts w:ascii="Cambria Math" w:hAnsi="Cambria Math" w:cs="Times New Roman"/>
+              </w:rPr>
+              <m:t>ijk</m:t>
+            </m:r>
+          </m:sub>
+        </m:sSub>
+      </m:oMath>
+      <w:r>
+        <w:rPr>
+          <w:rFonts w:ascii="Times New Roman" w:hAnsi="Times New Roman" w:cs="Times New Roman"/>
+        </w:rPr>
+        <w:t xml:space="preserve"> is the catch in trap </w:t>
+      </w:r>
+      <m:oMath>
+        <m:r>
+          <w:rPr>
+            <w:rFonts w:ascii="Cambria Math" w:hAnsi="Cambria Math" w:cs="Times New Roman"/>
+          </w:rPr>
+          <m:t>k</m:t>
+        </m:r>
+      </m:oMath>
+      <w:r>
+        <w:rPr>
+          <w:rFonts w:ascii="Times New Roman" w:hAnsi="Times New Roman" w:cs="Times New Roman"/>
+        </w:rPr>
+        <w:t xml:space="preserve"> on day </w:t>
+      </w:r>
+      <m:oMath>
+        <m:r>
+          <w:rPr>
+            <w:rFonts w:ascii="Cambria Math" w:hAnsi="Cambria Math" w:cs="Times New Roman"/>
+          </w:rPr>
+          <m:t>j</m:t>
+        </m:r>
+      </m:oMath>
+      <w:r>
+        <w:rPr>
+          <w:rFonts w:ascii="Times New Roman" w:hAnsi="Times New Roman" w:cs="Times New Roman"/>
+        </w:rPr>
+        <w:t xml:space="preserve"> within year-site </w:t>
+      </w:r>
+      <m:oMath>
+        <m:r>
+          <w:rPr>
+            <w:rFonts w:ascii="Cambria Math" w:hAnsi="Cambria Math" w:cs="Times New Roman"/>
+          </w:rPr>
+          <m:t>i</m:t>
+        </m:r>
+      </m:oMath>
+      <w:r>
+        <w:rPr>
+          <w:rFonts w:ascii="Times New Roman" w:hAnsi="Times New Roman" w:cs="Times New Roman"/>
+        </w:rPr>
+        <w:t xml:space="preserve">; </w:t>
+      </w:r>
+      <m:oMath>
+        <m:sSub>
+          <m:sSubPr>
+            <m:ctrlPr>
+              <w:rPr>
+                <w:rFonts w:ascii="Cambria Math" w:hAnsi="Cambria Math" w:cs="Times New Roman"/>
+              </w:rPr>
+            </m:ctrlPr>
+          </m:sSubPr>
+          <m:e>
+            <m:r>
+              <w:rPr>
+                <w:rFonts w:ascii="Cambria Math" w:hAnsi="Cambria Math" w:cs="Times New Roman"/>
+              </w:rPr>
+              <m:t>β</m:t>
+            </m:r>
+          </m:e>
+          <m:sub>
+            <m:r>
+              <w:rPr>
+                <w:rFonts w:ascii="Cambria Math" w:hAnsi="Cambria Math" w:cs="Times New Roman"/>
+              </w:rPr>
+              <m:t>0</m:t>
+            </m:r>
+          </m:sub>
+        </m:sSub>
+      </m:oMath>
+      <w:r>
+        <w:rPr>
+          <w:rFonts w:ascii="Times New Roman" w:hAnsi="Times New Roman" w:cs="Times New Roman"/>
+        </w:rPr>
+        <w:t xml:space="preserve"> is the log expected catch in the control treatment (C); </w:t>
+      </w:r>
+      <m:oMath>
+        <m:sSub>
+          <m:sSubPr>
+            <m:ctrlPr>
+              <w:rPr>
+                <w:rFonts w:ascii="Cambria Math" w:hAnsi="Cambria Math" w:cs="Times New Roman"/>
+              </w:rPr>
+            </m:ctrlPr>
+          </m:sSubPr>
+          <m:e>
+            <m:r>
+              <w:rPr>
+                <w:rFonts w:ascii="Cambria Math" w:hAnsi="Cambria Math" w:cs="Times New Roman"/>
+              </w:rPr>
+              <m:t>β</m:t>
+            </m:r>
+          </m:e>
+          <m:sub>
+            <m:r>
+              <w:rPr>
+                <w:rFonts w:ascii="Cambria Math" w:hAnsi="Cambria Math" w:cs="Times New Roman"/>
+              </w:rPr>
+              <m:t>A</m:t>
+            </m:r>
+          </m:sub>
+        </m:sSub>
+      </m:oMath>
+      <w:r>
+        <w:rPr>
+          <w:rFonts w:ascii="Times New Roman" w:hAnsi="Times New Roman" w:cs="Times New Roman"/>
+        </w:rPr>
+        <w:t xml:space="preserve">, </w:t>
+      </w:r>
+      <m:oMath>
+        <m:sSub>
+          <m:sSubPr>
+            <m:ctrlPr>
+              <w:rPr>
+                <w:rFonts w:ascii="Cambria Math" w:hAnsi="Cambria Math" w:cs="Times New Roman"/>
+              </w:rPr>
+            </m:ctrlPr>
+          </m:sSubPr>
+          <m:e>
+            <m:r>
+              <w:rPr>
+                <w:rFonts w:ascii="Cambria Math" w:hAnsi="Cambria Math" w:cs="Times New Roman"/>
+              </w:rPr>
+              <m:t>β</m:t>
+            </m:r>
+          </m:e>
+          <m:sub>
+            <m:r>
+              <w:rPr>
+                <w:rFonts w:ascii="Cambria Math" w:hAnsi="Cambria Math" w:cs="Times New Roman"/>
+              </w:rPr>
+              <m:t>E</m:t>
+            </m:r>
+          </m:sub>
+        </m:sSub>
+      </m:oMath>
+      <w:r>
+        <w:rPr>
+          <w:rFonts w:ascii="Times New Roman" w:hAnsi="Times New Roman" w:cs="Times New Roman"/>
+        </w:rPr>
+        <w:t xml:space="preserve"> and </w:t>
+      </w:r>
+      <m:oMath>
+        <m:sSub>
+          <m:sSubPr>
+            <m:ctrlPr>
+              <w:rPr>
+                <w:rFonts w:ascii="Cambria Math" w:hAnsi="Cambria Math" w:cs="Times New Roman"/>
+              </w:rPr>
+            </m:ctrlPr>
+          </m:sSubPr>
+          <m:e>
+            <m:r>
+              <w:rPr>
+                <w:rFonts w:ascii="Cambria Math" w:hAnsi="Cambria Math" w:cs="Times New Roman"/>
+              </w:rPr>
+              <m:t>β</m:t>
+            </m:r>
+          </m:e>
+          <m:sub>
+            <m:r>
+              <w:rPr>
+                <w:rFonts w:ascii="Cambria Math" w:hAnsi="Cambria Math" w:cs="Times New Roman"/>
+              </w:rPr>
+              <m:t>J</m:t>
+            </m:r>
+          </m:sub>
+        </m:sSub>
+      </m:oMath>
+      <w:r>
+        <w:rPr>
+          <w:rFonts w:ascii="Times New Roman" w:hAnsi="Times New Roman" w:cs="Times New Roman"/>
+        </w:rPr>
+        <w:t xml:space="preserve"> are the effects of the amino-acid (A), whole-egg (E) and egg-juice (J) treatments relative to the control, coded through the treatment indicator variables </w:t>
+      </w:r>
+      <m:oMath>
+        <m:sSub>
+          <m:sSubPr>
+            <m:ctrlPr>
+              <w:rPr>
+                <w:rFonts w:ascii="Cambria Math" w:hAnsi="Cambria Math" w:cs="Times New Roman"/>
+              </w:rPr>
+            </m:ctrlPr>
+          </m:sSubPr>
+          <m:e>
+            <m:r>
+              <w:rPr>
+                <w:rFonts w:ascii="Cambria Math" w:hAnsi="Cambria Math" w:cs="Times New Roman"/>
+              </w:rPr>
+              <m:t>x</m:t>
+            </m:r>
+          </m:e>
+          <m:sub>
+            <m:r>
+              <w:rPr>
+                <w:rFonts w:ascii="Cambria Math" w:hAnsi="Cambria Math" w:cs="Times New Roman"/>
+              </w:rPr>
+              <m:t>A</m:t>
+            </m:r>
+          </m:sub>
+        </m:sSub>
+      </m:oMath>
+      <w:r>
+        <w:rPr>
+          <w:rFonts w:ascii="Times New Roman" w:hAnsi="Times New Roman" w:cs="Times New Roman"/>
+        </w:rPr>
+        <w:t xml:space="preserve">, </w:t>
+      </w:r>
+      <m:oMath>
+        <m:sSub>
+          <m:sSubPr>
+            <m:ctrlPr>
+              <w:rPr>
+                <w:rFonts w:ascii="Cambria Math" w:hAnsi="Cambria Math" w:cs="Times New Roman"/>
+              </w:rPr>
+            </m:ctrlPr>
+          </m:sSubPr>
+          <m:e>
+            <m:r>
+              <w:rPr>
+                <w:rFonts w:ascii="Cambria Math" w:hAnsi="Cambria Math" w:cs="Times New Roman"/>
+              </w:rPr>
+              <m:t>x</m:t>
+            </m:r>
+          </m:e>
+          <m:sub>
+            <m:r>
+              <w:rPr>
+                <w:rFonts w:ascii="Cambria Math" w:hAnsi="Cambria Math" w:cs="Times New Roman"/>
+              </w:rPr>
+              <m:t>E</m:t>
+            </m:r>
+          </m:sub>
+        </m:sSub>
+      </m:oMath>
+      <w:r>
+        <w:rPr>
+          <w:rFonts w:ascii="Times New Roman" w:hAnsi="Times New Roman" w:cs="Times New Roman"/>
+        </w:rPr>
+        <w:t xml:space="preserve"> and </w:t>
+      </w:r>
+      <m:oMath>
+        <m:sSub>
+          <m:sSubPr>
+            <m:ctrlPr>
+              <w:rPr>
+                <w:rFonts w:ascii="Cambria Math" w:hAnsi="Cambria Math" w:cs="Times New Roman"/>
+              </w:rPr>
+            </m:ctrlPr>
+          </m:sSubPr>
+          <m:e>
+            <m:r>
+              <w:rPr>
+                <w:rFonts w:ascii="Cambria Math" w:hAnsi="Cambria Math" w:cs="Times New Roman"/>
+              </w:rPr>
+              <m:t>x</m:t>
+            </m:r>
+          </m:e>
+          <m:sub>
+            <m:r>
+              <w:rPr>
+                <w:rFonts w:ascii="Cambria Math" w:hAnsi="Cambria Math" w:cs="Times New Roman"/>
+              </w:rPr>
+              <m:t>J</m:t>
+            </m:r>
+          </m:sub>
+        </m:sSub>
+      </m:oMath>
+      <w:r>
+        <w:rPr>
+          <w:rFonts w:ascii="Times New Roman" w:hAnsi="Times New Roman" w:cs="Times New Roman"/>
+        </w:rPr>
+        <w:t xml:space="preserve">; and </w:t>
+      </w:r>
+      <m:oMath>
+        <m:sSub>
+          <m:sSubPr>
+            <m:ctrlPr>
+              <w:rPr>
+                <w:rFonts w:ascii="Cambria Math" w:hAnsi="Cambria Math" w:cs="Times New Roman"/>
+              </w:rPr>
+            </m:ctrlPr>
+          </m:sSubPr>
+          <m:e>
+            <m:r>
+              <w:rPr>
+                <w:rFonts w:ascii="Cambria Math" w:hAnsi="Cambria Math" w:cs="Times New Roman"/>
+              </w:rPr>
+              <m:t>u</m:t>
+            </m:r>
+          </m:e>
+          <m:sub>
+            <m:r>
+              <w:rPr>
+                <w:rFonts w:ascii="Cambria Math" w:hAnsi="Cambria Math" w:cs="Times New Roman"/>
+              </w:rPr>
+              <m:t>i</m:t>
+            </m:r>
+          </m:sub>
+        </m:sSub>
+      </m:oMath>
+      <w:r>
+        <w:rPr>
+          <w:rFonts w:ascii="Times New Roman" w:hAnsi="Times New Roman" w:cs="Times New Roman"/>
+        </w:rPr>
+        <w:t xml:space="preserve"> and </w:t>
+      </w:r>
+      <m:oMath>
+        <m:sSub>
+          <m:sSubPr>
+            <m:ctrlPr>
+              <w:rPr>
+                <w:rFonts w:ascii="Cambria Math" w:hAnsi="Cambria Math" w:cs="Times New Roman"/>
+              </w:rPr>
+            </m:ctrlPr>
+          </m:sSubPr>
+          <m:e>
+            <m:r>
+              <w:rPr>
+                <w:rFonts w:ascii="Cambria Math" w:hAnsi="Cambria Math" w:cs="Times New Roman"/>
+              </w:rPr>
+              <m:t>v</m:t>
+            </m:r>
+          </m:e>
+          <m:sub>
+            <m:r>
+              <w:rPr>
+                <w:rFonts w:ascii="Cambria Math" w:hAnsi="Cambria Math" w:cs="Times New Roman"/>
+              </w:rPr>
+              <m:t>ij</m:t>
+            </m:r>
+          </m:sub>
+        </m:sSub>
+      </m:oMath>
+      <w:r>
+        <w:rPr>
+          <w:rFonts w:ascii="Times New Roman" w:hAnsi="Times New Roman" w:cs="Times New Roman"/>
+        </w:rPr>
+        <w:t xml:space="preserve"> are random intercepts for year-site and for sampling day nested within year-site, with the double subscript </w:t>
+      </w:r>
+      <m:oMath>
+        <m:r>
+          <w:rPr>
+            <w:rFonts w:ascii="Cambria Math" w:hAnsi="Cambria Math" w:cs="Times New Roman"/>
+          </w:rPr>
+          <m:t>ij</m:t>
+        </m:r>
+      </m:oMath>
+      <w:r>
+        <w:rPr>
+          <w:rFonts w:ascii="Times New Roman" w:hAnsi="Times New Roman" w:cs="Times New Roman"/>
+        </w:rPr>
+        <w:t xml:space="preserve"> denoting that each day belongs to a single year-site. The Poisson likelihood imposes </w:t>
+      </w:r>
+      <m:oMath>
+        <m:r>
+          <m:rPr>
+            <m:sty m:val="p"/>
+          </m:rPr>
+          <w:rPr>
+            <w:rFonts w:ascii="Cambria Math" w:hAnsi="Cambria Math" w:cs="Times New Roman"/>
+          </w:rPr>
+          <m:t>Var</m:t>
+        </m:r>
+        <m:d>
+          <m:dPr>
+            <m:ctrlPr>
+              <w:rPr>
+                <w:rFonts w:ascii="Cambria Math" w:hAnsi="Cambria Math" w:cs="Times New Roman"/>
+              </w:rPr>
+            </m:ctrlPr>
+          </m:dPr>
+          <m:e>
+            <m:sSub>
+              <m:sSubPr>
+                <m:ctrlPr>
+                  <w:rPr>
+                    <w:rFonts w:ascii="Cambria Math" w:hAnsi="Cambria Math" w:cs="Times New Roman"/>
+                  </w:rPr>
+                </m:ctrlPr>
+              </m:sSubPr>
+              <m:e>
+                <m:r>
+                  <w:rPr>
+                    <w:rFonts w:ascii="Cambria Math" w:hAnsi="Cambria Math" w:cs="Times New Roman"/>
+                  </w:rPr>
+                  <m:t>y</m:t>
+                </m:r>
+              </m:e>
+              <m:sub>
+                <m:r>
+                  <w:rPr>
+                    <w:rFonts w:ascii="Cambria Math" w:hAnsi="Cambria Math" w:cs="Times New Roman"/>
+                  </w:rPr>
+                  <m:t>ijk</m:t>
+                </m:r>
+              </m:sub>
+            </m:sSub>
+          </m:e>
+        </m:d>
+        <m:r>
+          <m:rPr>
+            <m:sty m:val="p"/>
+          </m:rPr>
+          <w:rPr>
+            <w:rFonts w:ascii="Cambria Math" w:hAnsi="Cambria Math" w:cs="Times New Roman"/>
+          </w:rPr>
+          <m:t>=</m:t>
+        </m:r>
+        <m:sSub>
+          <m:sSubPr>
+            <m:ctrlPr>
+              <w:rPr>
+                <w:rFonts w:ascii="Cambria Math" w:hAnsi="Cambria Math" w:cs="Times New Roman"/>
+              </w:rPr>
+            </m:ctrlPr>
+          </m:sSubPr>
+          <m:e>
+            <m:r>
+              <w:rPr>
+                <w:rFonts w:ascii="Cambria Math" w:hAnsi="Cambria Math" w:cs="Times New Roman"/>
+              </w:rPr>
+              <m:t>μ</m:t>
+            </m:r>
+          </m:e>
+          <m:sub>
+            <m:r>
+              <w:rPr>
+                <w:rFonts w:ascii="Cambria Math" w:hAnsi="Cambria Math" w:cs="Times New Roman"/>
+              </w:rPr>
+              <m:t>ijk</m:t>
+            </m:r>
+          </m:sub>
+        </m:sSub>
+      </m:oMath>
+      <w:r>
+        <w:rPr>
+          <w:rFonts w:ascii="Times New Roman" w:hAnsi="Times New Roman" w:cs="Times New Roman"/>
+        </w:rPr>
+        <w:t>.</w:t>
+      </w:r>
+    </w:p>
+    <w:p>
+      <w:pPr>
+        <w:pStyle w:val="BodyText"/>
+        <w:rPr>
+          <w:rFonts w:ascii="Times New Roman" w:hAnsi="Times New Roman" w:cs="Times New Roman"/>
+        </w:rPr>
+      </w:pPr>
+      <w:r>
+        <w:rPr>
+          <w:rFonts w:ascii="Times New Roman" w:hAnsi="Times New Roman" w:cs="Times New Roman"/>
+        </w:rPr>
+        <w:t xml:space="preserve">The negative binomial model shared the same linear predictor and random-effect structure, but relaxed this assumption by introducing a dispersion parameter </w:t>
+      </w:r>
+      <m:oMath>
+        <m:r>
+          <w:rPr>
+            <w:rFonts w:ascii="Cambria Math" w:hAnsi="Cambria Math" w:cs="Times New Roman"/>
+          </w:rPr>
+          <m:t>θ</m:t>
+        </m:r>
+      </m:oMath>
+      <w:r>
+        <w:rPr>
+          <w:rFonts w:ascii="Times New Roman" w:hAnsi="Times New Roman" w:cs="Times New Roman"/>
+        </w:rPr>
+        <w:t>:</w:t>
+      </w:r>
+    </w:p>
+    <w:p>
+      <w:pPr>
+        <w:pStyle w:val="BodyText"/>
+        <w:rPr>
+          <w:rFonts w:ascii="Times New Roman" w:hAnsi="Times New Roman" w:cs="Times New Roman"/>
+        </w:rPr>
+      </w:pPr>
+      <m:oMathPara>
+        <m:oMathParaPr>
+          <m:jc m:val="center"/>
+        </m:oMathParaPr>
+        <m:oMath>
+          <m:sSub>
+            <m:sSubPr>
+              <m:ctrlPr>
+                <w:rPr>
+                  <w:rFonts w:ascii="Cambria Math" w:hAnsi="Cambria Math" w:cs="Times New Roman"/>
+                </w:rPr>
+              </m:ctrlPr>
+            </m:sSubPr>
+            <m:e>
+              <m:r>
+                <w:rPr>
+                  <w:rFonts w:ascii="Cambria Math" w:hAnsi="Cambria Math" w:cs="Times New Roman"/>
+                </w:rPr>
+                <m:t>y</m:t>
+              </m:r>
+            </m:e>
+            <m:sub>
+              <m:r>
+                <w:rPr>
+                  <w:rFonts w:ascii="Cambria Math" w:hAnsi="Cambria Math" w:cs="Times New Roman"/>
+                </w:rPr>
+                <m:t>ijk</m:t>
+              </m:r>
+            </m:sub>
+          </m:sSub>
+          <m:r>
+            <m:rPr>
+              <m:sty m:val="p"/>
+            </m:rPr>
+            <w:rPr>
+              <w:rFonts w:ascii="Cambria Math" w:hAnsi="Cambria Math" w:cs="Times New Roman"/>
+            </w:rPr>
+            <m:t>∣</m:t>
+          </m:r>
+          <m:sSub>
+            <m:sSubPr>
+              <m:ctrlPr>
+                <w:rPr>
+                  <w:rFonts w:ascii="Cambria Math" w:hAnsi="Cambria Math" w:cs="Times New Roman"/>
+                </w:rPr>
+              </m:ctrlPr>
+            </m:sSubPr>
+            <m:e>
+              <m:r>
+                <w:rPr>
+                  <w:rFonts w:ascii="Cambria Math" w:hAnsi="Cambria Math" w:cs="Times New Roman"/>
+                </w:rPr>
+                <m:t>u</m:t>
+              </m:r>
+            </m:e>
+            <m:sub>
+              <m:r>
+                <w:rPr>
+                  <w:rFonts w:ascii="Cambria Math" w:hAnsi="Cambria Math" w:cs="Times New Roman"/>
+                </w:rPr>
+                <m:t>i</m:t>
+              </m:r>
+            </m:sub>
+          </m:sSub>
+          <m:r>
+            <m:rPr>
+              <m:sty m:val="p"/>
+            </m:rPr>
+            <w:rPr>
+              <w:rFonts w:ascii="Cambria Math" w:hAnsi="Cambria Math" w:cs="Times New Roman"/>
+            </w:rPr>
+            <m:t>,</m:t>
+          </m:r>
+          <m:sSub>
+            <m:sSubPr>
+              <m:ctrlPr>
+                <w:rPr>
+                  <w:rFonts w:ascii="Cambria Math" w:hAnsi="Cambria Math" w:cs="Times New Roman"/>
+                </w:rPr>
+              </m:ctrlPr>
+            </m:sSubPr>
+            <m:e>
+              <m:r>
+                <w:rPr>
+                  <w:rFonts w:ascii="Cambria Math" w:hAnsi="Cambria Math" w:cs="Times New Roman"/>
+                </w:rPr>
+                <m:t>v</m:t>
+              </m:r>
+            </m:e>
+            <m:sub>
+              <m:r>
+                <w:rPr>
+                  <w:rFonts w:ascii="Cambria Math" w:hAnsi="Cambria Math" w:cs="Times New Roman"/>
+                </w:rPr>
+                <m:t>ij</m:t>
+              </m:r>
+            </m:sub>
+          </m:sSub>
+          <m:r>
+            <w:rPr>
+              <w:rFonts w:ascii="Cambria Math" w:hAnsi="Cambria Math" w:cs="Times New Roman"/>
+            </w:rPr>
+            <m:t> </m:t>
+          </m:r>
+          <m:r>
+            <m:rPr>
+              <m:sty m:val="p"/>
+            </m:rPr>
+            <w:rPr>
+              <w:rFonts w:ascii="Cambria Math" w:hAnsi="Cambria Math" w:cs="Times New Roman"/>
+            </w:rPr>
+            <m:t>∼</m:t>
+          </m:r>
+          <m:r>
+            <w:rPr>
+              <w:rFonts w:ascii="Cambria Math" w:hAnsi="Cambria Math" w:cs="Times New Roman"/>
+            </w:rPr>
+            <m:t> </m:t>
+          </m:r>
+          <m:r>
+            <m:rPr>
+              <m:nor/>
+            </m:rPr>
+            <w:rPr>
+              <w:rFonts w:ascii="Times New Roman" w:hAnsi="Times New Roman" w:cs="Times New Roman"/>
+            </w:rPr>
+            <m:t>NB</m:t>
+          </m:r>
+          <m:d>
+            <m:dPr>
+              <m:ctrlPr>
+                <w:rPr>
+                  <w:rFonts w:ascii="Cambria Math" w:hAnsi="Cambria Math" w:cs="Times New Roman"/>
+                </w:rPr>
+              </m:ctrlPr>
+            </m:dPr>
+            <m:e>
+              <m:sSub>
+                <m:sSubPr>
+                  <m:ctrlPr>
+                    <w:rPr>
+                      <w:rFonts w:ascii="Cambria Math" w:hAnsi="Cambria Math" w:cs="Times New Roman"/>
+                    </w:rPr>
+                  </m:ctrlPr>
+                </m:sSubPr>
+                <m:e>
+                  <m:r>
+                    <w:rPr>
+                      <w:rFonts w:ascii="Cambria Math" w:hAnsi="Cambria Math" w:cs="Times New Roman"/>
+                    </w:rPr>
+                    <m:t>μ</m:t>
+                  </m:r>
+                </m:e>
+                <m:sub>
+                  <m:r>
+                    <w:rPr>
+                      <w:rFonts w:ascii="Cambria Math" w:hAnsi="Cambria Math" w:cs="Times New Roman"/>
+                    </w:rPr>
+                    <m:t>ijk</m:t>
+                  </m:r>
+                </m:sub>
+              </m:sSub>
+              <m:r>
+                <m:rPr>
+                  <m:sty m:val="p"/>
+                </m:rPr>
+                <w:rPr>
+                  <w:rFonts w:ascii="Cambria Math" w:hAnsi="Cambria Math" w:cs="Times New Roman"/>
+                </w:rPr>
+                <m:t>,</m:t>
+              </m:r>
+              <m:r>
+                <w:rPr>
+                  <w:rFonts w:ascii="Cambria Math" w:hAnsi="Cambria Math" w:cs="Times New Roman"/>
+                </w:rPr>
+                <m:t> θ</m:t>
+              </m:r>
+            </m:e>
+          </m:d>
+          <m:r>
+            <m:rPr>
+              <m:sty m:val="p"/>
+            </m:rPr>
+            <w:rPr>
+              <w:rFonts w:ascii="Cambria Math" w:hAnsi="Cambria Math" w:cs="Times New Roman"/>
+            </w:rPr>
+            <m:t>,</m:t>
+          </m:r>
+        </m:oMath>
+      </m:oMathPara>
+    </w:p>
+    <w:p>
+      <w:pPr>
+        <w:pStyle w:val="FirstParagraph"/>
+        <w:rPr>
+          <w:rFonts w:ascii="Times New Roman" w:hAnsi="Times New Roman" w:cs="Times New Roman"/>
+        </w:rPr>
+      </w:pPr>
+      <w:r>
+        <w:rPr>
+          <w:rFonts w:ascii="Times New Roman" w:hAnsi="Times New Roman" w:cs="Times New Roman"/>
+        </w:rPr>
+        <w:t xml:space="preserve">under which </w:t>
+      </w:r>
+      <m:oMath>
+        <m:r>
+          <m:rPr>
+            <m:sty m:val="p"/>
+          </m:rPr>
+          <w:rPr>
+            <w:rFonts w:ascii="Cambria Math" w:hAnsi="Cambria Math" w:cs="Times New Roman"/>
+          </w:rPr>
+          <m:t>Var</m:t>
+        </m:r>
+        <m:d>
+          <m:dPr>
+            <m:ctrlPr>
+              <w:rPr>
+                <w:rFonts w:ascii="Cambria Math" w:hAnsi="Cambria Math" w:cs="Times New Roman"/>
+              </w:rPr>
+            </m:ctrlPr>
+          </m:dPr>
+          <m:e>
+            <m:sSub>
+              <m:sSubPr>
+                <m:ctrlPr>
+                  <w:rPr>
+                    <w:rFonts w:ascii="Cambria Math" w:hAnsi="Cambria Math" w:cs="Times New Roman"/>
+                  </w:rPr>
+                </m:ctrlPr>
+              </m:sSubPr>
+              <m:e>
+                <m:r>
+                  <w:rPr>
+                    <w:rFonts w:ascii="Cambria Math" w:hAnsi="Cambria Math" w:cs="Times New Roman"/>
+                  </w:rPr>
+                  <m:t>y</m:t>
+                </m:r>
+              </m:e>
+              <m:sub>
+                <m:r>
+                  <w:rPr>
+                    <w:rFonts w:ascii="Cambria Math" w:hAnsi="Cambria Math" w:cs="Times New Roman"/>
+                  </w:rPr>
+                  <m:t>ijk</m:t>
+                </m:r>
+              </m:sub>
+            </m:sSub>
+          </m:e>
+        </m:d>
+        <m:r>
+          <m:rPr>
+            <m:sty m:val="p"/>
+          </m:rPr>
+          <w:rPr>
+            <w:rFonts w:ascii="Cambria Math" w:hAnsi="Cambria Math" w:cs="Times New Roman"/>
+          </w:rPr>
+          <m:t>=</m:t>
+        </m:r>
+        <m:sSub>
+          <m:sSubPr>
+            <m:ctrlPr>
+              <w:rPr>
+                <w:rFonts w:ascii="Cambria Math" w:hAnsi="Cambria Math" w:cs="Times New Roman"/>
+              </w:rPr>
+            </m:ctrlPr>
+          </m:sSubPr>
+          <m:e>
+            <m:r>
+              <w:rPr>
+                <w:rFonts w:ascii="Cambria Math" w:hAnsi="Cambria Math" w:cs="Times New Roman"/>
+              </w:rPr>
+              <m:t>μ</m:t>
+            </m:r>
+          </m:e>
+          <m:sub>
+            <m:r>
+              <w:rPr>
+                <w:rFonts w:ascii="Cambria Math" w:hAnsi="Cambria Math" w:cs="Times New Roman"/>
+              </w:rPr>
+              <m:t>ijk</m:t>
+            </m:r>
+          </m:sub>
+        </m:sSub>
+        <m:r>
+          <m:rPr>
+            <m:sty m:val="p"/>
+          </m:rPr>
+          <w:rPr>
+            <w:rFonts w:ascii="Cambria Math" w:hAnsi="Cambria Math" w:cs="Times New Roman"/>
+          </w:rPr>
+          <m:t>+</m:t>
+        </m:r>
+        <m:sSubSup>
+          <m:sSubSupPr>
+            <m:ctrlPr>
+              <w:rPr>
+                <w:rFonts w:ascii="Cambria Math" w:hAnsi="Cambria Math" w:cs="Times New Roman"/>
+              </w:rPr>
+            </m:ctrlPr>
+          </m:sSubSupPr>
+          <m:e>
+            <m:r>
+              <w:rPr>
+                <w:rFonts w:ascii="Cambria Math" w:hAnsi="Cambria Math" w:cs="Times New Roman"/>
+              </w:rPr>
+              <m:t>μ</m:t>
+            </m:r>
+          </m:e>
+          <m:sub>
+            <m:r>
+              <w:rPr>
+                <w:rFonts w:ascii="Cambria Math" w:hAnsi="Cambria Math" w:cs="Times New Roman"/>
+              </w:rPr>
+              <m:t>ijk</m:t>
+            </m:r>
+          </m:sub>
+          <m:sup>
+            <m:r>
+              <w:rPr>
+                <w:rFonts w:ascii="Cambria Math" w:hAnsi="Cambria Math" w:cs="Times New Roman"/>
+              </w:rPr>
+              <m:t>2</m:t>
+            </m:r>
+          </m:sup>
+        </m:sSubSup>
+        <m:r>
+          <m:rPr>
+            <m:sty m:val="p"/>
+          </m:rPr>
+          <w:rPr>
+            <w:rFonts w:ascii="Cambria Math" w:hAnsi="Cambria Math" w:cs="Times New Roman"/>
+          </w:rPr>
+          <m:t>/</m:t>
+        </m:r>
+        <m:r>
+          <w:rPr>
+            <w:rFonts w:ascii="Cambria Math" w:hAnsi="Cambria Math" w:cs="Times New Roman"/>
+          </w:rPr>
+          <m:t>θ</m:t>
+        </m:r>
+      </m:oMath>
+      <w:r>
+        <w:rPr>
+          <w:rFonts w:ascii="Times New Roman" w:hAnsi="Times New Roman" w:cs="Times New Roman"/>
+        </w:rPr>
+        <w:t xml:space="preserve">, so that the variance exceeds the mean and approaches the Poisson case as </w:t>
+      </w:r>
+      <m:oMath>
+        <m:r>
+          <w:rPr>
+            <w:rFonts w:ascii="Cambria Math" w:hAnsi="Cambria Math" w:cs="Times New Roman"/>
+          </w:rPr>
+          <m:t>θ</m:t>
+        </m:r>
+        <m:r>
+          <m:rPr>
+            <m:sty m:val="p"/>
+          </m:rPr>
+          <w:rPr>
+            <w:rFonts w:ascii="Cambria Math" w:hAnsi="Cambria Math" w:cs="Times New Roman"/>
+          </w:rPr>
+          <m:t>→∞</m:t>
+        </m:r>
+      </m:oMath>
+      <w:r>
+        <w:rPr>
+          <w:rFonts w:ascii="Times New Roman" w:hAnsi="Times New Roman" w:cs="Times New Roman"/>
+        </w:rPr>
+        <w:t>.</w:t>
+      </w:r>
+    </w:p>
+    <w:p>
+      <w:pPr>
         <w:pStyle w:val="Heading1"/>
         <w:rPr>
           <w:rFonts w:ascii="Times New Roman" w:hAnsi="Times New Roman" w:cs="Times New Roman"/>
         </w:rPr>
       </w:pPr>
-      <w:bookmarkStart w:id="3" w:name="results"/>
+      <w:bookmarkStart w:id="4" w:name="results"/>
       <w:bookmarkEnd w:id="0"/>
-      <w:bookmarkEnd w:id="2"/>
+      <w:bookmarkEnd w:id="3"/>
       <w:r>
         <w:rPr>
           <w:rStyle w:val="SectionNumber"/>
           <w:rFonts w:ascii="Times New Roman" w:hAnsi="Times New Roman" w:cs="Times New Roman"/>
         </w:rPr>
+        <w:lastRenderedPageBreak/>
         <w:t>2</w:t>
       </w:r>
       <w:r>
@@ -317,7 +2071,7 @@
           <w:rFonts w:ascii="Times New Roman" w:hAnsi="Times New Roman" w:cs="Times New Roman"/>
         </w:rPr>
       </w:pPr>
-      <w:bookmarkStart w:id="4" w:name="model-selection"/>
+      <w:bookmarkStart w:id="5" w:name="model-selection"/>
       <w:r>
         <w:rPr>
           <w:rStyle w:val="SectionNumber"/>
@@ -364,18 +2118,32 @@
     </w:p>
     <w:p>
       <w:pPr>
+        <w:rPr>
+          <w:rFonts w:ascii="Times New Roman" w:hAnsi="Times New Roman" w:cs="Times New Roman"/>
+        </w:rPr>
+      </w:pPr>
+      <w:r>
+        <w:rPr>
+          <w:rFonts w:ascii="Times New Roman" w:hAnsi="Times New Roman" w:cs="Times New Roman"/>
+        </w:rPr>
+        <w:br w:type="page"/>
+      </w:r>
+    </w:p>
+    <w:p>
+      <w:pPr>
         <w:pStyle w:val="Heading2"/>
         <w:rPr>
           <w:rFonts w:ascii="Times New Roman" w:hAnsi="Times New Roman" w:cs="Times New Roman"/>
         </w:rPr>
       </w:pPr>
-      <w:bookmarkStart w:id="5" w:name="random-effects"/>
-      <w:bookmarkEnd w:id="4"/>
+      <w:bookmarkStart w:id="6" w:name="random-effects"/>
+      <w:bookmarkEnd w:id="5"/>
       <w:r>
         <w:rPr>
           <w:rStyle w:val="SectionNumber"/>
           <w:rFonts w:ascii="Times New Roman" w:hAnsi="Times New Roman" w:cs="Times New Roman"/>
         </w:rPr>
+        <w:lastRenderedPageBreak/>
         <w:t>2.2</w:t>
       </w:r>
       <w:r>
@@ -397,14 +2165,7 @@
         <w:rPr>
           <w:rFonts w:ascii="Times New Roman" w:hAnsi="Times New Roman" w:cs="Times New Roman"/>
         </w:rPr>
-        <w:t xml:space="preserve">The negative binomial models for both species included random intercepts for year-site and for sampling day nested within year-site. The variance associated with both intercepts was non-negligible, indicating that traps sampled on the same day or within the same year-site were not independent, and supporting the use of random effects for these components. For both species, daily variation in catch rate was greater than year-site variation. For sculpin, day SD ≈ 0.92 </w:t>
-      </w:r>
-      <w:r>
-        <w:rPr>
-          <w:rFonts w:ascii="Times New Roman" w:hAnsi="Times New Roman" w:cs="Times New Roman"/>
-        </w:rPr>
-        <w:lastRenderedPageBreak/>
-        <w:t>versus year-site SD ≈ 0.64 (log scale); for three-spine, the difference was smaller (day SD ≈ 0.78, year-site SD ≈ 0.63; log scale).</w:t>
+        <w:t>The negative binomial models for both species included random intercepts for year-site and for sampling day nested within year-site. The variance associated with both intercepts was non-negligible, indicating that traps sampled on the same day or within the same year-site were not independent, and supporting the use of random effects for these components. For both species, daily variation in catch rate was greater than year-site variation. For sculpin, day SD ≈ 0.92 versus year-site SD ≈ 0.64 (log scale); for three-spine, the difference was smaller (day SD ≈ 0.78, year-site SD ≈ 0.63; log scale).</w:t>
       </w:r>
     </w:p>
     <w:p>
@@ -414,8 +2175,8 @@
           <w:rFonts w:ascii="Times New Roman" w:hAnsi="Times New Roman" w:cs="Times New Roman"/>
         </w:rPr>
       </w:pPr>
-      <w:bookmarkStart w:id="6" w:name="fixed-effects"/>
-      <w:bookmarkEnd w:id="5"/>
+      <w:bookmarkStart w:id="7" w:name="fixed-effects"/>
+      <w:bookmarkEnd w:id="6"/>
       <w:r>
         <w:rPr>
           <w:rStyle w:val="SectionNumber"/>
@@ -458,16 +2219,16 @@
           <w:noProof/>
         </w:rPr>
         <w:drawing>
-          <wp:inline distT="0" distB="0" distL="0" distR="0" wp14:anchorId="5412E53F" wp14:editId="73F1926D">
+          <wp:inline distT="0" distB="0" distL="0" distR="0" wp14:anchorId="5BAD53C3" wp14:editId="23733A81">
             <wp:extent cx="4587290" cy="3211103"/>
             <wp:effectExtent l="0" t="0" r="0" b="0"/>
-            <wp:docPr id="29" name="Picture" descr="Figure 2. Sculpin: model-estimated catch per trap by treatment (negative binomial GLMM), with 95% confidence intervals."/>
+            <wp:docPr id="30" name="Picture" descr="Figure 2. Sculpin: model-estimated catch per trap by treatment (negative binomial GLMM), with 95% confidence intervals."/>
             <wp:cNvGraphicFramePr/>
             <a:graphic xmlns:a="http://schemas.openxmlformats.org/drawingml/2006/main">
               <a:graphicData uri="http://schemas.openxmlformats.org/drawingml/2006/picture">
                 <pic:pic xmlns:pic="http://schemas.openxmlformats.org/drawingml/2006/picture">
                   <pic:nvPicPr>
-                    <pic:cNvPr id="30" name="Picture" descr="C:\Users\Michael%20Kinneen\Google%20Drive%20Streaming\My%20Drive\UW_masters_Punt\egg_odor_glmm\output\reports\egg_odor_report_files/figure-docx/sculpin-emm-figure-1.png"/>
+                    <pic:cNvPr id="31" name="Picture" descr="C:\Users\Michael%20Kinneen\Google%20Drive%20Streaming\My%20Drive\UW_masters_Punt\egg_odor_glmm\output\reports\egg_odor_report_files/figure-docx/sculpin-emm-figure-1.png"/>
                     <pic:cNvPicPr>
                       <a:picLocks noChangeAspect="1" noChangeArrowheads="1"/>
                     </pic:cNvPicPr>
@@ -555,16 +2316,16 @@
           <w:noProof/>
         </w:rPr>
         <w:drawing>
-          <wp:inline distT="0" distB="0" distL="0" distR="0" wp14:anchorId="158B590F" wp14:editId="1DE458DC">
+          <wp:inline distT="0" distB="0" distL="0" distR="0" wp14:anchorId="16983877" wp14:editId="68BAD949">
             <wp:extent cx="4587290" cy="3211103"/>
             <wp:effectExtent l="0" t="0" r="0" b="0"/>
-            <wp:docPr id="32" name="Picture" descr="Figure 3. Three-spine: model-estimated catch per trap by treatment (negative binomial GLMM), with 95% confidence intervals."/>
+            <wp:docPr id="33" name="Picture" descr="Figure 3. Three-spine: model-estimated catch per trap by treatment (negative binomial GLMM), with 95% confidence intervals."/>
             <wp:cNvGraphicFramePr/>
             <a:graphic xmlns:a="http://schemas.openxmlformats.org/drawingml/2006/main">
               <a:graphicData uri="http://schemas.openxmlformats.org/drawingml/2006/picture">
                 <pic:pic xmlns:pic="http://schemas.openxmlformats.org/drawingml/2006/picture">
                   <pic:nvPicPr>
-                    <pic:cNvPr id="33" name="Picture" descr="C:\Users\Michael%20Kinneen\Google%20Drive%20Streaming\My%20Drive\UW_masters_Punt\egg_odor_glmm\output\reports\egg_odor_report_files/figure-docx/threespine-emm-figure-1.png"/>
+                    <pic:cNvPr id="34" name="Picture" descr="C:\Users\Michael%20Kinneen\Google%20Drive%20Streaming\My%20Drive\UW_masters_Punt\egg_odor_glmm\output\reports\egg_odor_report_files/figure-docx/threespine-emm-figure-1.png"/>
                     <pic:cNvPicPr>
                       <a:picLocks noChangeAspect="1" noChangeArrowheads="1"/>
                     </pic:cNvPicPr>
@@ -618,9 +2379,9 @@
           <w:rFonts w:ascii="Times New Roman" w:hAnsi="Times New Roman" w:cs="Times New Roman"/>
         </w:rPr>
       </w:pPr>
-      <w:bookmarkStart w:id="7" w:name="discussion"/>
-      <w:bookmarkEnd w:id="3"/>
-      <w:bookmarkEnd w:id="6"/>
+      <w:bookmarkStart w:id="8" w:name="discussion"/>
+      <w:bookmarkEnd w:id="4"/>
+      <w:bookmarkEnd w:id="7"/>
       <w:r>
         <w:rPr>
           <w:rStyle w:val="SectionNumber"/>
@@ -671,8 +2432,8 @@
           <w:rFonts w:ascii="Times New Roman" w:hAnsi="Times New Roman" w:cs="Times New Roman"/>
         </w:rPr>
       </w:pPr>
-      <w:bookmarkStart w:id="8" w:name="references"/>
-      <w:bookmarkEnd w:id="7"/>
+      <w:bookmarkStart w:id="9" w:name="references"/>
+      <w:bookmarkEnd w:id="8"/>
       <w:r>
         <w:rPr>
           <w:rFonts w:ascii="Times New Roman" w:hAnsi="Times New Roman" w:cs="Times New Roman"/>
@@ -688,8 +2449,8 @@
           <w:rFonts w:ascii="Times New Roman" w:hAnsi="Times New Roman" w:cs="Times New Roman"/>
         </w:rPr>
       </w:pPr>
-      <w:bookmarkStart w:id="9" w:name="ref-R-glmmTMB"/>
-      <w:bookmarkStart w:id="10" w:name="refs"/>
+      <w:bookmarkStart w:id="10" w:name="ref-R-glmmTMB"/>
+      <w:bookmarkStart w:id="11" w:name="refs"/>
       <w:r>
         <w:rPr>
           <w:rFonts w:ascii="Times New Roman" w:hAnsi="Times New Roman" w:cs="Times New Roman"/>
@@ -733,8 +2494,8 @@
           <w:rFonts w:ascii="Times New Roman" w:hAnsi="Times New Roman" w:cs="Times New Roman"/>
         </w:rPr>
       </w:pPr>
-      <w:bookmarkStart w:id="11" w:name="ref-R-DHARMa"/>
-      <w:bookmarkEnd w:id="9"/>
+      <w:bookmarkStart w:id="12" w:name="ref-R-DHARMa"/>
+      <w:bookmarkEnd w:id="10"/>
       <w:r>
         <w:rPr>
           <w:rFonts w:ascii="Times New Roman" w:hAnsi="Times New Roman" w:cs="Times New Roman"/>
@@ -778,8 +2539,8 @@
           <w:rFonts w:ascii="Times New Roman" w:hAnsi="Times New Roman" w:cs="Times New Roman"/>
         </w:rPr>
       </w:pPr>
-      <w:bookmarkStart w:id="12" w:name="ref-R-emmeans"/>
-      <w:bookmarkEnd w:id="11"/>
+      <w:bookmarkStart w:id="13" w:name="ref-R-emmeans"/>
+      <w:bookmarkEnd w:id="12"/>
       <w:r>
         <w:rPr>
           <w:rFonts w:ascii="Times New Roman" w:hAnsi="Times New Roman" w:cs="Times New Roman"/>
@@ -823,8 +2584,8 @@
           <w:rFonts w:ascii="Times New Roman" w:hAnsi="Times New Roman" w:cs="Times New Roman"/>
         </w:rPr>
       </w:pPr>
-      <w:bookmarkStart w:id="13" w:name="ref-R-base"/>
-      <w:bookmarkEnd w:id="12"/>
+      <w:bookmarkStart w:id="14" w:name="ref-R-base"/>
+      <w:bookmarkEnd w:id="13"/>
       <w:r>
         <w:rPr>
           <w:rFonts w:ascii="Times New Roman" w:hAnsi="Times New Roman" w:cs="Times New Roman"/>
@@ -860,9 +2621,9 @@
         </w:rPr>
         <w:t>.</w:t>
       </w:r>
-      <w:bookmarkEnd w:id="8"/>
-      <w:bookmarkEnd w:id="10"/>
-      <w:bookmarkEnd w:id="13"/>
+      <w:bookmarkEnd w:id="9"/>
+      <w:bookmarkEnd w:id="11"/>
+      <w:bookmarkEnd w:id="14"/>
     </w:p>
     <w:sectPr>
       <w:pgSz w:w="12240" w:h="15840"/>
@@ -878,7 +2639,7 @@
   <w:abstractNum w:abstractNumId="0" w15:restartNumberingAfterBreak="0">
     <w:nsid w:val="0000A990"/>
     <w:multiLevelType w:val="multilevel"/>
-    <w:tmpl w:val="1BEC764C"/>
+    <w:tmpl w:val="AB06790E"/>
     <w:lvl w:ilvl="0">
       <w:numFmt w:val="bullet"/>
       <w:lvlText w:val=" "/>
@@ -952,7 +2713,7 @@
       </w:pPr>
     </w:lvl>
   </w:abstractNum>
-  <w:num w:numId="1" w16cid:durableId="685139268">
+  <w:num w:numId="1" w16cid:durableId="92824323">
     <w:abstractNumId w:val="0"/>
   </w:num>
 </w:numbering>

</xml_diff>